<commit_message>
Atualiza apostilas e slides das Aulas 1-4 e agenda das Aulas 1, 2, 5, 6 e 7
</commit_message>
<xml_diff>
--- a/Aula 01 - 03-09-2026/Aula 1 - Apostila do Aluno.docx
+++ b/Aula 01 - 03-09-2026/Aula 1 - Apostila do Aluno.docx
@@ -519,6 +519,391 @@
     </w:p>
     <w:p>
       <w:pPr>
+        <w:pStyle w:val="Heading2"/>
+      </w:pPr>
+      <w:r>
+        <w:t>2.5 Tipos de regra de negócio</w:t>
+      </w:r>
+    </w:p>
+    <w:p>
+      <w:pPr/>
+      <w:r>
+        <w:t>Nem toda regra de negócio tem a mesma função. Reconhecer o tipo ajuda a saber onde ela vai aparecer no sistema: numa validação, num cálculo automático ou só na definição de um termo. As quatro categorias mais comuns são:</w:t>
+      </w:r>
+    </w:p>
+    <w:tbl>
+      <w:tblPr>
+        <w:tblStyle w:val="TableGrid"/>
+        <w:tblW w:type="auto" w:w="0"/>
+        <w:tblLook w:firstColumn="1" w:firstRow="1" w:lastColumn="0" w:lastRow="0" w:noHBand="0" w:noVBand="1" w:val="04A0"/>
+      </w:tblPr>
+      <w:tblGrid>
+        <w:gridCol w:w="3324"/>
+        <w:gridCol w:w="3324"/>
+        <w:gridCol w:w="3324"/>
+      </w:tblGrid>
+      <w:tr>
+        <w:tc>
+          <w:tcPr>
+            <w:tcW w:type="dxa" w:w="3324"/>
+            <w:shd w:fill="1F497D"/>
+          </w:tcPr>
+          <w:p>
+            <w:r/>
+            <w:r>
+              <w:rPr>
+                <w:b/>
+                <w:color w:val="FFFFFF"/>
+              </w:rPr>
+              <w:t>Tipo</w:t>
+            </w:r>
+          </w:p>
+        </w:tc>
+        <w:tc>
+          <w:tcPr>
+            <w:tcW w:type="dxa" w:w="3324"/>
+            <w:shd w:fill="1F497D"/>
+          </w:tcPr>
+          <w:p>
+            <w:r/>
+            <w:r>
+              <w:rPr>
+                <w:b/>
+                <w:color w:val="FFFFFF"/>
+              </w:rPr>
+              <w:t>O que faz</w:t>
+            </w:r>
+          </w:p>
+        </w:tc>
+        <w:tc>
+          <w:tcPr>
+            <w:tcW w:type="dxa" w:w="3324"/>
+            <w:shd w:fill="1F497D"/>
+          </w:tcPr>
+          <w:p>
+            <w:r/>
+            <w:r>
+              <w:rPr>
+                <w:b/>
+                <w:color w:val="FFFFFF"/>
+              </w:rPr>
+              <w:t>Exemplo (TechBurger)</w:t>
+            </w:r>
+          </w:p>
+        </w:tc>
+      </w:tr>
+      <w:tr>
+        <w:tc>
+          <w:tcPr>
+            <w:tcW w:type="dxa" w:w="3324"/>
+          </w:tcPr>
+          <w:p>
+            <w:r/>
+            <w:r>
+              <w:t>Restrição (constraint)</w:t>
+            </w:r>
+          </w:p>
+        </w:tc>
+        <w:tc>
+          <w:tcPr>
+            <w:tcW w:type="dxa" w:w="3324"/>
+          </w:tcPr>
+          <w:p>
+            <w:r/>
+            <w:r>
+              <w:t>Limita ou bloqueia uma ação quando uma condição é atendida.</w:t>
+            </w:r>
+          </w:p>
+        </w:tc>
+        <w:tc>
+          <w:tcPr>
+            <w:tcW w:type="dxa" w:w="3324"/>
+          </w:tcPr>
+          <w:p>
+            <w:r/>
+            <w:r>
+              <w:t>"Pedidos abaixo de R$ 15,00 não podem ser confirmados pelo aplicativo."</w:t>
+            </w:r>
+          </w:p>
+        </w:tc>
+      </w:tr>
+      <w:tr>
+        <w:tc>
+          <w:tcPr>
+            <w:tcW w:type="dxa" w:w="3324"/>
+          </w:tcPr>
+          <w:p>
+            <w:r/>
+            <w:r>
+              <w:t>Fato / definição</w:t>
+            </w:r>
+          </w:p>
+        </w:tc>
+        <w:tc>
+          <w:tcPr>
+            <w:tcW w:type="dxa" w:w="3324"/>
+          </w:tcPr>
+          <w:p>
+            <w:r/>
+            <w:r>
+              <w:t>Define um termo ou um relacionamento entre elementos do negócio, sem ação.</w:t>
+            </w:r>
+          </w:p>
+        </w:tc>
+        <w:tc>
+          <w:tcPr>
+            <w:tcW w:type="dxa" w:w="3324"/>
+          </w:tcPr>
+          <w:p>
+            <w:r/>
+            <w:r>
+              <w:t>"Um pedido pertence a um único cliente."</w:t>
+            </w:r>
+          </w:p>
+        </w:tc>
+      </w:tr>
+      <w:tr>
+        <w:tc>
+          <w:tcPr>
+            <w:tcW w:type="dxa" w:w="3324"/>
+          </w:tcPr>
+          <w:p>
+            <w:r/>
+            <w:r>
+              <w:t>Cálculo (derivação)</w:t>
+            </w:r>
+          </w:p>
+        </w:tc>
+        <w:tc>
+          <w:tcPr>
+            <w:tcW w:type="dxa" w:w="3324"/>
+          </w:tcPr>
+          <w:p>
+            <w:r/>
+            <w:r>
+              <w:t>Deriva um novo valor a partir de outros já existentes.</w:t>
+            </w:r>
+          </w:p>
+        </w:tc>
+        <w:tc>
+          <w:tcPr>
+            <w:tcW w:type="dxa" w:w="3324"/>
+          </w:tcPr>
+          <w:p>
+            <w:r/>
+            <w:r>
+              <w:t>"O total do pedido é a soma dos itens menos os descontos aplicáveis."</w:t>
+            </w:r>
+          </w:p>
+        </w:tc>
+      </w:tr>
+      <w:tr>
+        <w:tc>
+          <w:tcPr>
+            <w:tcW w:type="dxa" w:w="3324"/>
+          </w:tcPr>
+          <w:p>
+            <w:r/>
+            <w:r>
+              <w:t>Disparador de ação (action enabler)</w:t>
+            </w:r>
+          </w:p>
+        </w:tc>
+        <w:tc>
+          <w:tcPr>
+            <w:tcW w:type="dxa" w:w="3324"/>
+          </w:tcPr>
+          <w:p>
+            <w:r/>
+            <w:r>
+              <w:t>Aciona automaticamente um evento quando a condição ocorre.</w:t>
+            </w:r>
+          </w:p>
+        </w:tc>
+        <w:tc>
+          <w:tcPr>
+            <w:tcW w:type="dxa" w:w="3324"/>
+          </w:tcPr>
+          <w:p>
+            <w:r/>
+            <w:r>
+              <w:t>"Ao atingir 100 pontos, o combo grátis é concedido automaticamente."</w:t>
+            </w:r>
+          </w:p>
+        </w:tc>
+      </w:tr>
+    </w:tbl>
+    <w:p>
+      <w:pPr/>
+    </w:p>
+    <w:p>
+      <w:pPr/>
+      <w:r>
+        <w:t>Perceba que a estrutura Condição / Ação / Exceção que vimos na seção 2.3 se aplica melhor a restrições e disparadores de ação — regras do tipo fato/definição normalmente não têm "ação", e regras de cálculo têm uma fórmula no lugar da ação.</w:t>
+      </w:r>
+    </w:p>
+    <w:p>
+      <w:pPr>
+        <w:pStyle w:val="Heading2"/>
+      </w:pPr>
+      <w:r>
+        <w:t>2.6 Boas práticas para escrever uma regra de negócio</w:t>
+      </w:r>
+    </w:p>
+    <w:p>
+      <w:pPr/>
+      <w:r>
+        <w:t>Uma regra de negócio bem escrita facilita a vida de quem vai transformá-la em requisito. Ela deve ser:</w:t>
+      </w:r>
+    </w:p>
+    <w:p>
+      <w:pPr>
+        <w:pStyle w:val="ListBullet"/>
+      </w:pPr>
+      <w:r>
+        <w:t>Atômica — trata de uma única decisão. Se a frase tem "e" ou "ou" escondendo duas regras, separe-as.</w:t>
+      </w:r>
+    </w:p>
+    <w:p>
+      <w:pPr>
+        <w:pStyle w:val="ListBullet"/>
+      </w:pPr>
+      <w:r>
+        <w:t>Verificável — dá para checar, de forma objetiva, se está sendo cumprida ou não.</w:t>
+      </w:r>
+    </w:p>
+    <w:p>
+      <w:pPr>
+        <w:pStyle w:val="ListBullet"/>
+      </w:pPr>
+      <w:r>
+        <w:t>Redigida na linguagem do negócio — sem termos técnicos de sistema ("query", "flag", "endpoint").</w:t>
+      </w:r>
+    </w:p>
+    <w:p>
+      <w:pPr>
+        <w:pStyle w:val="ListBullet"/>
+      </w:pPr>
+      <w:r>
+        <w:t>Sem ambiguidade — não abre margem para duas interpretações diferentes.</w:t>
+      </w:r>
+    </w:p>
+    <w:p>
+      <w:pPr>
+        <w:pStyle w:val="ListBullet"/>
+      </w:pPr>
+      <w:r>
+        <w:t>Rastreável a um dono — alguém da área de negócio deve poder confirmar se ela ainda é válida.</w:t>
+      </w:r>
+    </w:p>
+    <w:p>
+      <w:pPr/>
+      <w:r>
+        <w:t>Compare as duas versões da mesma regra:</w:t>
+      </w:r>
+    </w:p>
+    <w:tbl>
+      <w:tblPr>
+        <w:tblStyle w:val="TableGrid"/>
+        <w:tblW w:type="auto" w:w="0"/>
+        <w:tblLook w:firstColumn="1" w:firstRow="1" w:lastColumn="0" w:lastRow="0" w:noHBand="0" w:noVBand="1" w:val="04A0"/>
+      </w:tblPr>
+      <w:tblGrid>
+        <w:gridCol w:w="3324"/>
+        <w:gridCol w:w="3324"/>
+        <w:gridCol w:w="3324"/>
+      </w:tblGrid>
+      <w:tr>
+        <w:tc>
+          <w:tcPr>
+            <w:tcW w:type="dxa" w:w="3324"/>
+            <w:shd w:fill="1F497D"/>
+          </w:tcPr>
+          <w:p>
+            <w:r/>
+            <w:r>
+              <w:rPr>
+                <w:b/>
+                <w:color w:val="FFFFFF"/>
+              </w:rPr>
+              <w:t>Versão ruim</w:t>
+            </w:r>
+          </w:p>
+        </w:tc>
+        <w:tc>
+          <w:tcPr>
+            <w:tcW w:type="dxa" w:w="3324"/>
+            <w:shd w:fill="1F497D"/>
+          </w:tcPr>
+          <w:p>
+            <w:r/>
+            <w:r>
+              <w:rPr>
+                <w:b/>
+                <w:color w:val="FFFFFF"/>
+              </w:rPr>
+              <w:t>Por que é ruim</w:t>
+            </w:r>
+          </w:p>
+        </w:tc>
+        <w:tc>
+          <w:tcPr>
+            <w:tcW w:type="dxa" w:w="3324"/>
+            <w:shd w:fill="1F497D"/>
+          </w:tcPr>
+          <w:p>
+            <w:r/>
+            <w:r>
+              <w:rPr>
+                <w:b/>
+                <w:color w:val="FFFFFF"/>
+              </w:rPr>
+              <w:t>Versão melhorada</w:t>
+            </w:r>
+          </w:p>
+        </w:tc>
+      </w:tr>
+      <w:tr>
+        <w:tc>
+          <w:tcPr>
+            <w:tcW w:type="dxa" w:w="3324"/>
+          </w:tcPr>
+          <w:p>
+            <w:r/>
+            <w:r>
+              <w:t>"O sistema trata bem os clientes fiéis."</w:t>
+            </w:r>
+          </w:p>
+        </w:tc>
+        <w:tc>
+          <w:tcPr>
+            <w:tcW w:type="dxa" w:w="3324"/>
+          </w:tcPr>
+          <w:p>
+            <w:r/>
+            <w:r>
+              <w:t>Não é verificável nem atômica: o que é "tratar bem"? Qual condição dispara isso?</w:t>
+            </w:r>
+          </w:p>
+        </w:tc>
+        <w:tc>
+          <w:tcPr>
+            <w:tcW w:type="dxa" w:w="3324"/>
+          </w:tcPr>
+          <w:p>
+            <w:r/>
+            <w:r>
+              <w:t>"Clientes com 100 pontos ou mais de fidelidade recebem um combo grátis na próxima compra, e a pontuação é zerada."</w:t>
+            </w:r>
+          </w:p>
+        </w:tc>
+      </w:tr>
+    </w:tbl>
+    <w:p>
+      <w:pPr/>
+    </w:p>
+    <w:p>
+      <w:pPr>
         <w:pStyle w:val="Heading1"/>
       </w:pPr>
       <w:r>
@@ -650,6 +1035,196 @@
     </w:p>
     <w:p>
       <w:pPr>
+        <w:pStyle w:val="Heading2"/>
+      </w:pPr>
+      <w:r>
+        <w:t>3.4 Do negócio ao sistema: a cadeia de requisitos</w:t>
+      </w:r>
+    </w:p>
+    <w:p>
+      <w:pPr/>
+      <w:r>
+        <w:t>Uma regra de negócio raramente vira um requisito de sistema num único passo. É comum passar por uma cadeia de três níveis, cada um mais próximo da tela e do código:</w:t>
+      </w:r>
+    </w:p>
+    <w:tbl>
+      <w:tblPr>
+        <w:tblStyle w:val="TableGrid"/>
+        <w:tblW w:type="auto" w:w="0"/>
+        <w:tblLook w:firstColumn="1" w:firstRow="1" w:lastColumn="0" w:lastRow="0" w:noHBand="0" w:noVBand="1" w:val="04A0"/>
+      </w:tblPr>
+      <w:tblGrid>
+        <w:gridCol w:w="3324"/>
+        <w:gridCol w:w="3324"/>
+        <w:gridCol w:w="3324"/>
+      </w:tblGrid>
+      <w:tr>
+        <w:tc>
+          <w:tcPr>
+            <w:tcW w:type="dxa" w:w="3324"/>
+            <w:shd w:fill="1F497D"/>
+          </w:tcPr>
+          <w:p>
+            <w:r/>
+            <w:r>
+              <w:rPr>
+                <w:b/>
+                <w:color w:val="FFFFFF"/>
+              </w:rPr>
+              <w:t>Nível</w:t>
+            </w:r>
+          </w:p>
+        </w:tc>
+        <w:tc>
+          <w:tcPr>
+            <w:tcW w:type="dxa" w:w="3324"/>
+            <w:shd w:fill="1F497D"/>
+          </w:tcPr>
+          <w:p>
+            <w:r/>
+            <w:r>
+              <w:rPr>
+                <w:b/>
+                <w:color w:val="FFFFFF"/>
+              </w:rPr>
+              <w:t>Pergunta que responde</w:t>
+            </w:r>
+          </w:p>
+        </w:tc>
+        <w:tc>
+          <w:tcPr>
+            <w:tcW w:type="dxa" w:w="3324"/>
+            <w:shd w:fill="1F497D"/>
+          </w:tcPr>
+          <w:p>
+            <w:r/>
+            <w:r>
+              <w:rPr>
+                <w:b/>
+                <w:color w:val="FFFFFF"/>
+              </w:rPr>
+              <w:t>Exemplo (TechBurger)</w:t>
+            </w:r>
+          </w:p>
+        </w:tc>
+      </w:tr>
+      <w:tr>
+        <w:tc>
+          <w:tcPr>
+            <w:tcW w:type="dxa" w:w="3324"/>
+          </w:tcPr>
+          <w:p>
+            <w:r/>
+            <w:r>
+              <w:t>Requisito de negócio</w:t>
+            </w:r>
+          </w:p>
+        </w:tc>
+        <w:tc>
+          <w:tcPr>
+            <w:tcW w:type="dxa" w:w="3324"/>
+          </w:tcPr>
+          <w:p>
+            <w:r/>
+            <w:r>
+              <w:t>Por que o sistema precisa existir / o que a empresa quer alcançar?</w:t>
+            </w:r>
+          </w:p>
+        </w:tc>
+        <w:tc>
+          <w:tcPr>
+            <w:tcW w:type="dxa" w:w="3324"/>
+          </w:tcPr>
+          <w:p>
+            <w:r/>
+            <w:r>
+              <w:t>Reduzir prejuízo com clientes que cancelam pedidos com frequência.</w:t>
+            </w:r>
+          </w:p>
+        </w:tc>
+      </w:tr>
+      <w:tr>
+        <w:tc>
+          <w:tcPr>
+            <w:tcW w:type="dxa" w:w="3324"/>
+          </w:tcPr>
+          <w:p>
+            <w:r/>
+            <w:r>
+              <w:t>Requisito de usuário</w:t>
+            </w:r>
+          </w:p>
+        </w:tc>
+        <w:tc>
+          <w:tcPr>
+            <w:tcW w:type="dxa" w:w="3324"/>
+          </w:tcPr>
+          <w:p>
+            <w:r/>
+            <w:r>
+              <w:t>O que a pessoa que usa o sistema precisa conseguir fazer?</w:t>
+            </w:r>
+          </w:p>
+        </w:tc>
+        <w:tc>
+          <w:tcPr>
+            <w:tcW w:type="dxa" w:w="3324"/>
+          </w:tcPr>
+          <w:p>
+            <w:r/>
+            <w:r>
+              <w:t>Como atendente, preciso ver se um cliente está bloqueado antes de aceitar um novo pedido.</w:t>
+            </w:r>
+          </w:p>
+        </w:tc>
+      </w:tr>
+      <w:tr>
+        <w:tc>
+          <w:tcPr>
+            <w:tcW w:type="dxa" w:w="3324"/>
+          </w:tcPr>
+          <w:p>
+            <w:r/>
+            <w:r>
+              <w:t>Requisito de sistema (funcional)</w:t>
+            </w:r>
+          </w:p>
+        </w:tc>
+        <w:tc>
+          <w:tcPr>
+            <w:tcW w:type="dxa" w:w="3324"/>
+          </w:tcPr>
+          <w:p>
+            <w:r/>
+            <w:r>
+              <w:t>O que exatamente o sistema deve fazer, em detalhe técnico?</w:t>
+            </w:r>
+          </w:p>
+        </w:tc>
+        <w:tc>
+          <w:tcPr>
+            <w:tcW w:type="dxa" w:w="3324"/>
+          </w:tcPr>
+          <w:p>
+            <w:r/>
+            <w:r>
+              <w:t>O sistema deve impedir a criação de novos pedidos para clientes com 3 ou mais cancelamentos no mês corrente.</w:t>
+            </w:r>
+          </w:p>
+        </w:tc>
+      </w:tr>
+    </w:tbl>
+    <w:p>
+      <w:pPr/>
+    </w:p>
+    <w:p>
+      <w:pPr/>
+      <w:r>
+        <w:t>Na prática, o requisito de sistema (funcional) é o nível que vamos aprender a escrever com detalhe na Aula 2 — mas ele só faz sentido quando conseguimos explicar de onde veio, subindo a cadeia até a regra de negócio original.</w:t>
+      </w:r>
+    </w:p>
+    <w:p>
+      <w:pPr>
         <w:pStyle w:val="Heading1"/>
       </w:pPr>
       <w:r>
@@ -755,6 +1330,246 @@
         </w:rPr>
         <w:t>Clientes que cancelam 3 pedidos ou mais em um mês ficam impedidos de fazer novos pedidos pelo aplicativo durante 15 dias, podendo continuar comprando normalmente no balcão.</w:t>
       </w:r>
+    </w:p>
+    <w:p>
+      <w:pPr>
+        <w:pStyle w:val="Heading2"/>
+      </w:pPr>
+      <w:r>
+        <w:t>4.1 Exemplo resolvido: regra de negócio em outro domínio</w:t>
+      </w:r>
+    </w:p>
+    <w:p>
+      <w:pPr/>
+      <w:r>
+        <w:t>Antes de praticar com a TechBurger, veja um exemplo já resolvido em outro contexto, para confirmar que você entendeu o método — regras de negócio aparecem em qualquer tipo de sistema, não só em delivery.</w:t>
+      </w:r>
+    </w:p>
+    <w:p>
+      <w:pPr/>
+      <w:r>
+        <w:t>A biblioteca comunitária "Ler Mais" está automatizando o empréstimo de livros. Hoje, cada associado pode manter até 3 livros emprestados ao mesmo tempo; ao tentar pegar um quarto livro, o empréstimo é recusado até que um dos três seja devolvido. O prazo padrão de empréstimo é de 14 dias, mas associados classificados como "professor" têm prazo estendido para 30 dias. Quando um livro é devolvido com atraso, é cobrada uma multa de R$ 1,00 por dia de atraso, exceto para livros reservados para leitura escolar, que nunca geram multa.</w:t>
+      </w:r>
+    </w:p>
+    <w:tbl>
+      <w:tblPr>
+        <w:tblStyle w:val="TableGrid"/>
+        <w:tblW w:type="auto" w:w="0"/>
+        <w:tblLook w:firstColumn="1" w:firstRow="1" w:lastColumn="0" w:lastRow="0" w:noHBand="0" w:noVBand="1" w:val="04A0"/>
+      </w:tblPr>
+      <w:tblGrid>
+        <w:gridCol w:w="2493"/>
+        <w:gridCol w:w="2493"/>
+        <w:gridCol w:w="2493"/>
+        <w:gridCol w:w="2493"/>
+      </w:tblGrid>
+      <w:tr>
+        <w:tc>
+          <w:tcPr>
+            <w:tcW w:type="dxa" w:w="2493"/>
+            <w:shd w:fill="1F497D"/>
+          </w:tcPr>
+          <w:p>
+            <w:r/>
+            <w:r>
+              <w:rPr>
+                <w:b/>
+                <w:color w:val="FFFFFF"/>
+              </w:rPr>
+              <w:t>Regra (resumo)</w:t>
+            </w:r>
+          </w:p>
+        </w:tc>
+        <w:tc>
+          <w:tcPr>
+            <w:tcW w:type="dxa" w:w="2493"/>
+            <w:shd w:fill="1F497D"/>
+          </w:tcPr>
+          <w:p>
+            <w:r/>
+            <w:r>
+              <w:rPr>
+                <w:b/>
+                <w:color w:val="FFFFFF"/>
+              </w:rPr>
+              <w:t>Condição</w:t>
+            </w:r>
+          </w:p>
+        </w:tc>
+        <w:tc>
+          <w:tcPr>
+            <w:tcW w:type="dxa" w:w="2493"/>
+            <w:shd w:fill="1F497D"/>
+          </w:tcPr>
+          <w:p>
+            <w:r/>
+            <w:r>
+              <w:rPr>
+                <w:b/>
+                <w:color w:val="FFFFFF"/>
+              </w:rPr>
+              <w:t>Ação</w:t>
+            </w:r>
+          </w:p>
+        </w:tc>
+        <w:tc>
+          <w:tcPr>
+            <w:tcW w:type="dxa" w:w="2493"/>
+            <w:shd w:fill="1F497D"/>
+          </w:tcPr>
+          <w:p>
+            <w:r/>
+            <w:r>
+              <w:rPr>
+                <w:b/>
+                <w:color w:val="FFFFFF"/>
+              </w:rPr>
+              <w:t>Exceção</w:t>
+            </w:r>
+          </w:p>
+        </w:tc>
+      </w:tr>
+      <w:tr>
+        <w:tc>
+          <w:tcPr>
+            <w:tcW w:type="dxa" w:w="2493"/>
+          </w:tcPr>
+          <w:p>
+            <w:r/>
+            <w:r>
+              <w:t>Limite de empréstimos simultâneos</w:t>
+            </w:r>
+          </w:p>
+        </w:tc>
+        <w:tc>
+          <w:tcPr>
+            <w:tcW w:type="dxa" w:w="2493"/>
+          </w:tcPr>
+          <w:p>
+            <w:r/>
+            <w:r>
+              <w:t>Associado já possui 3 livros emprestados</w:t>
+            </w:r>
+          </w:p>
+        </w:tc>
+        <w:tc>
+          <w:tcPr>
+            <w:tcW w:type="dxa" w:w="2493"/>
+          </w:tcPr>
+          <w:p>
+            <w:r/>
+            <w:r>
+              <w:t>Recusar novo empréstimo</w:t>
+            </w:r>
+          </w:p>
+        </w:tc>
+        <w:tc>
+          <w:tcPr>
+            <w:tcW w:type="dxa" w:w="2493"/>
+          </w:tcPr>
+          <w:p>
+            <w:r/>
+            <w:r>
+              <w:t>—</w:t>
+            </w:r>
+          </w:p>
+        </w:tc>
+      </w:tr>
+      <w:tr>
+        <w:tc>
+          <w:tcPr>
+            <w:tcW w:type="dxa" w:w="2493"/>
+          </w:tcPr>
+          <w:p>
+            <w:r/>
+            <w:r>
+              <w:t>Prazo estendido para professores</w:t>
+            </w:r>
+          </w:p>
+        </w:tc>
+        <w:tc>
+          <w:tcPr>
+            <w:tcW w:type="dxa" w:w="2493"/>
+          </w:tcPr>
+          <w:p>
+            <w:r/>
+            <w:r>
+              <w:t>Associado classificado como "professor"</w:t>
+            </w:r>
+          </w:p>
+        </w:tc>
+        <w:tc>
+          <w:tcPr>
+            <w:tcW w:type="dxa" w:w="2493"/>
+          </w:tcPr>
+          <w:p>
+            <w:r/>
+            <w:r>
+              <w:t>Definir prazo de devolução em 30 dias (em vez de 14)</w:t>
+            </w:r>
+          </w:p>
+        </w:tc>
+        <w:tc>
+          <w:tcPr>
+            <w:tcW w:type="dxa" w:w="2493"/>
+          </w:tcPr>
+          <w:p>
+            <w:r/>
+            <w:r>
+              <w:t>—</w:t>
+            </w:r>
+          </w:p>
+        </w:tc>
+      </w:tr>
+      <w:tr>
+        <w:tc>
+          <w:tcPr>
+            <w:tcW w:type="dxa" w:w="2493"/>
+          </w:tcPr>
+          <w:p>
+            <w:r/>
+            <w:r>
+              <w:t>Multa por atraso</w:t>
+            </w:r>
+          </w:p>
+        </w:tc>
+        <w:tc>
+          <w:tcPr>
+            <w:tcW w:type="dxa" w:w="2493"/>
+          </w:tcPr>
+          <w:p>
+            <w:r/>
+            <w:r>
+              <w:t>Devolução realizada após o prazo</w:t>
+            </w:r>
+          </w:p>
+        </w:tc>
+        <w:tc>
+          <w:tcPr>
+            <w:tcW w:type="dxa" w:w="2493"/>
+          </w:tcPr>
+          <w:p>
+            <w:r/>
+            <w:r>
+              <w:t>Cobrar R$ 1,00 por dia de atraso</w:t>
+            </w:r>
+          </w:p>
+        </w:tc>
+        <w:tc>
+          <w:tcPr>
+            <w:tcW w:type="dxa" w:w="2493"/>
+          </w:tcPr>
+          <w:p>
+            <w:r/>
+            <w:r>
+              <w:t>Livros reservados para leitura escolar não geram multa</w:t>
+            </w:r>
+          </w:p>
+        </w:tc>
+      </w:tr>
+    </w:tbl>
+    <w:p>
+      <w:pPr/>
     </w:p>
     <w:p>
       <w:pPr>
@@ -1377,6 +2192,102 @@
           </w:p>
         </w:tc>
       </w:tr>
+      <w:tr>
+        <w:tc>
+          <w:tcPr>
+            <w:tcW w:type="dxa" w:w="4986"/>
+          </w:tcPr>
+          <w:p>
+            <w:r/>
+            <w:r>
+              <w:t>Restrição (constraint)</w:t>
+            </w:r>
+          </w:p>
+        </w:tc>
+        <w:tc>
+          <w:tcPr>
+            <w:tcW w:type="dxa" w:w="4986"/>
+          </w:tcPr>
+          <w:p>
+            <w:r/>
+            <w:r>
+              <w:t>Regra de negócio que limita ou bloqueia uma ação sob certa condição.</w:t>
+            </w:r>
+          </w:p>
+        </w:tc>
+      </w:tr>
+      <w:tr>
+        <w:tc>
+          <w:tcPr>
+            <w:tcW w:type="dxa" w:w="4986"/>
+          </w:tcPr>
+          <w:p>
+            <w:r/>
+            <w:r>
+              <w:t>Disparador de ação (action enabler)</w:t>
+            </w:r>
+          </w:p>
+        </w:tc>
+        <w:tc>
+          <w:tcPr>
+            <w:tcW w:type="dxa" w:w="4986"/>
+          </w:tcPr>
+          <w:p>
+            <w:r/>
+            <w:r>
+              <w:t>Regra de negócio que aciona automaticamente um evento quando a condição ocorre.</w:t>
+            </w:r>
+          </w:p>
+        </w:tc>
+      </w:tr>
+      <w:tr>
+        <w:tc>
+          <w:tcPr>
+            <w:tcW w:type="dxa" w:w="4986"/>
+          </w:tcPr>
+          <w:p>
+            <w:r/>
+            <w:r>
+              <w:t>Requisito de Negócio</w:t>
+            </w:r>
+          </w:p>
+        </w:tc>
+        <w:tc>
+          <w:tcPr>
+            <w:tcW w:type="dxa" w:w="4986"/>
+          </w:tcPr>
+          <w:p>
+            <w:r/>
+            <w:r>
+              <w:t>Descreve por que o sistema existe / o objetivo que a empresa quer alcançar com ele.</w:t>
+            </w:r>
+          </w:p>
+        </w:tc>
+      </w:tr>
+      <w:tr>
+        <w:tc>
+          <w:tcPr>
+            <w:tcW w:type="dxa" w:w="4986"/>
+          </w:tcPr>
+          <w:p>
+            <w:r/>
+            <w:r>
+              <w:t>Requisito de Usuário</w:t>
+            </w:r>
+          </w:p>
+        </w:tc>
+        <w:tc>
+          <w:tcPr>
+            <w:tcW w:type="dxa" w:w="4986"/>
+          </w:tcPr>
+          <w:p>
+            <w:r/>
+            <w:r>
+              <w:t>Descreve o que a pessoa que usa o sistema precisa conseguir fazer.</w:t>
+            </w:r>
+          </w:p>
+        </w:tc>
+      </w:tr>
     </w:tbl>
     <w:p/>
     <w:p>
@@ -1433,6 +2344,38 @@
       </w:pPr>
       <w:r>
         <w:t>6. Por que é importante identificar as regras de negócio antes de levantar os requisitos do sistema?</w:t>
+      </w:r>
+    </w:p>
+    <w:p>
+      <w:pPr>
+        <w:pStyle w:val="ListNumber"/>
+      </w:pPr>
+      <w:r>
+        <w:t>7. Classifique cada regra a seguir como Restrição, Fato/Definição, Cálculo ou Disparador de Ação: (a) "Um pedido pertence a um único cliente"; (b) "Ao completar 100 pontos, o combo grátis é concedido automaticamente".</w:t>
+      </w:r>
+    </w:p>
+    <w:p>
+      <w:pPr>
+        <w:pStyle w:val="ListNumber"/>
+      </w:pPr>
+      <w:r>
+        <w:t>8. Reescreva a regra ruim "O sistema é rápido para o cliente" seguindo as boas práticas da seção 2.6 (atômica, verificável, sem ambiguidade).</w:t>
+      </w:r>
+    </w:p>
+    <w:p>
+      <w:pPr>
+        <w:pStyle w:val="ListNumber"/>
+      </w:pPr>
+      <w:r>
+        <w:t>9. No exemplo da biblioteca "Ler Mais" (seção 4.1), identifique a Condição, a Ação e a Exceção da regra de multa por atraso.</w:t>
+      </w:r>
+    </w:p>
+    <w:p>
+      <w:pPr>
+        <w:pStyle w:val="ListNumber"/>
+      </w:pPr>
+      <w:r>
+        <w:t>10. Monte a cadeia completa (requisito de negócio → requisito de usuário → requisito de sistema) para a regra "pedidos com mais de 10 itens exigem confirmação manual de um gerente".</w:t>
       </w:r>
     </w:p>
     <w:sectPr>

</xml_diff>